<commit_message>
Complete author list for Si et al. (2024)
Co-Authored-By: Claude Sonnet 5.5 <noreply@anthropic.com>
Claude-Session: https://claude.ai/code/session_015MZUD2mugZGFJhoGnpeM66
</commit_message>
<xml_diff>
--- a/ISR_files/1_Manuscript.docx
+++ b/ISR_files/1_Manuscript.docx
@@ -6952,7 +6952,7 @@
         <w:pStyle w:val="BodyText"/>
       </w:pPr>
       <w:r>
-        <w:t xml:space="preserve">Si C, et al. (2024) Large language models help humans verify truthfulness—except when they are convincingly wrong.</w:t>
+        <w:t xml:space="preserve">Si C, Goyal N, Wu ST, Zhao C, Feng S, Daumé H III, Boyd-Graber J (2024) Large language models help humans verify truthfulness—except when they are convincingly wrong.</w:t>
       </w:r>
       <w:r>
         <w:t xml:space="preserve"> </w:t>
@@ -6968,7 +6968,7 @@
         <w:t xml:space="preserve"> </w:t>
       </w:r>
       <w:r>
-        <w:t xml:space="preserve">(Association for Computational Linguistics). arXiv:2310.12558. [AUTHORS: complete author list and venue.]</w:t>
+        <w:t xml:space="preserve">(Association for Computational Linguistics). arXiv:2310.12558.</w:t>
       </w:r>
     </w:p>
     <w:p>

</xml_diff>

<commit_message>
Complete author lists for Tu, Wei, Yang references
Co-Authored-By: Claude Sonnet 5.5 <noreply@anthropic.com>
Claude-Session: https://claude.ai/code/session_015MZUD2mugZGFJhoGnpeM66
</commit_message>
<xml_diff>
--- a/ISR_files/1_Manuscript.docx
+++ b/ISR_files/1_Manuscript.docx
@@ -7024,20 +7024,20 @@
         <w:pStyle w:val="BodyText"/>
       </w:pPr>
       <w:r>
-        <w:t xml:space="preserve">Tu, et al. (2025) Investigating factuality in long-form text generation: The roles of self-known and self-unknown.</w:t>
-      </w:r>
-      <w:r>
-        <w:t xml:space="preserve"> </w:t>
-      </w:r>
-      <w:r>
-        <w:rPr>
-          <w:iCs/>
-          <w:i/>
-        </w:rPr>
-        <w:t xml:space="preserve">Proc. 2025 Conf. Empirical Methods Natural Language Processing</w:t>
-      </w:r>
-      <w:r>
-        <w:t xml:space="preserve">. arXiv:2411.15993. [AUTHORS: complete author list.]</w:t>
+        <w:t xml:space="preserve">Tu L, Meng R, Joty S, Zhou Y, Yavuz S (2025) Investigating factuality in long-form text generation: The roles of self-known and self-unknown.</w:t>
+      </w:r>
+      <w:r>
+        <w:t xml:space="preserve"> </w:t>
+      </w:r>
+      <w:r>
+        <w:rPr>
+          <w:iCs/>
+          <w:i/>
+        </w:rPr>
+        <w:t xml:space="preserve">Proc. UncertaiNLP Workshop 2025</w:t>
+      </w:r>
+      <w:r>
+        <w:t xml:space="preserve">. arXiv:2411.15993. [AUTHORS: confirm venue (ACL Anthology lists UncertaiNLP 2025; another listing says EMNLP 2025).]</w:t>
       </w:r>
     </w:p>
     <w:p>
@@ -7069,7 +7069,7 @@
         <w:pStyle w:val="BodyText"/>
       </w:pPr>
       <w:r>
-        <w:t xml:space="preserve">Wei J, et al. (2024) Long-form factuality in large language models.</w:t>
+        <w:t xml:space="preserve">Wei J, Yang C, Song X, Lu Y, Hu N, Huang J, Tran D, Peng D, Liu R, Huang D, Du C, Le QV (2024) Long-form factuality in large language models.</w:t>
       </w:r>
       <w:r>
         <w:t xml:space="preserve"> </w:t>
@@ -7082,7 +7082,7 @@
         <w:t xml:space="preserve">Adv. Neural Inform. Processing Systems</w:t>
       </w:r>
       <w:r>
-        <w:t xml:space="preserve">, vol. 37. arXiv:2403.18802. [AUTHORS: complete author list.]</w:t>
+        <w:t xml:space="preserve">, vol. 37. arXiv:2403.18802.</w:t>
       </w:r>
     </w:p>
     <w:p>
@@ -7090,7 +7090,25 @@
         <w:pStyle w:val="BodyText"/>
       </w:pPr>
       <w:r>
-        <w:t xml:space="preserve">Yang, et al. (2025) Hallucinate at the last in long response generation: A case study on long document summarization. Preprint, arXiv:2505.15291. [AUTHORS: complete author list and venue.]</w:t>
+        <w:t xml:space="preserve">Yang J, Yoon S, Chang H, Kim B, Lee H (2025) Hallucinate at the last in long response generation: A case study on long document summarization. Preprint, arXiv:2505.15291. [AUTHORS: check the spelling of the fifth-listed name</w:t>
+      </w:r>
+      <w:r>
+        <w:t xml:space="preserve"> </w:t>
+      </w:r>
+      <w:r>
+        <w:t xml:space="preserve">“</w:t>
+      </w:r>
+      <w:r>
+        <w:t xml:space="preserve">Hwan Chang</w:t>
+      </w:r>
+      <w:r>
+        <w:t xml:space="preserve">”</w:t>
+      </w:r>
+      <w:r>
+        <w:t xml:space="preserve"> </w:t>
+      </w:r>
+      <w:r>
+        <w:t xml:space="preserve">and whether a venue exists.]</w:t>
       </w:r>
     </w:p>
     <w:p>

</xml_diff>

<commit_message>
Remove [AUTHORS] markers; keep list of open items in OPEN_ITEMS.md
Co-Authored-By: Claude Sonnet 5.5 <noreply@anthropic.com>
Claude-Session: https://claude.ai/code/session_015MZUD2mugZGFJhoGnpeM66
</commit_message>
<xml_diff>
--- a/ISR_files/1_Manuscript.docx
+++ b/ISR_files/1_Manuscript.docx
@@ -155,7 +155,7 @@
         <w:t xml:space="preserve"> </w:t>
       </w:r>
       <w:r>
-        <w:t xml:space="preserve">Recent work reports that unsupported content becomes more common later in long outputs, both in biographies and in long-document summarization (Tu et al. 2025; Yang et al. 2025) [AUTHORS: verify author lists and venues of these two entries]. Another line argues that a model may commit to an early error and then produce further errors it would not otherwise make, a phenomenon called snowballing (Zhang et al. 2024). Our contribution relative to this work is to treat the structure of errors as a statistical object, with an intensity function and a dispersion measure, and to ask what it implies for verification effort.</w:t>
+        <w:t xml:space="preserve">Recent work reports that unsupported content becomes more common later in long outputs, both in biographies and in long-document summarization (Tu et al. 2025; Yang et al. 2025). Another line argues that a model may commit to an early error and then produce further errors it would not otherwise make, a phenomenon called snowballing (Zhang et al. 2024). Our contribution relative to this work is to treat the structure of errors as a statistical object, with an intensity function and a dispersion measure, and to ask what it implies for verification effort.</w:t>
       </w:r>
     </w:p>
     <w:p>
@@ -209,7 +209,7 @@
         <w:t xml:space="preserve"> </w:t>
       </w:r>
       <w:r>
-        <w:t xml:space="preserve">Studies of human–AI decision making show that people tend to rely on AI advice even when it is wrong, and that interface designs that force deliberation can reduce overreliance (Buçinca et al. 2021; Parasuraman and Manzey 2010). In a study of crowdworkers checking claims, language-model explanations made verification faster than retrieved passages while leaving accuracy similar, and they induced overreliance when the explanation was wrong (Si et al. 2024) [AUTHORS: verify]. Explanations can reduce overreliance when they are cheap to check (Vasconcelos et al. 2023). A recent economic analysis frames the effects of AI progress as a race between cheap automation and costly human verification (Catalini et al. 2026) [AUTHORS: working paper; verify status]. We contribute a model of where verification effort should be placed, connected to the empirical structure of errors and to published parameters of human verification.</w:t>
+        <w:t xml:space="preserve">Studies of human–AI decision making show that people tend to rely on AI advice even when it is wrong, and that interface designs that force deliberation can reduce overreliance (Buçinca et al. 2021; Parasuraman and Manzey 2010). In a study of crowdworkers checking claims, language-model explanations made verification faster than retrieved passages while leaving accuracy similar, and they induced overreliance when the explanation was wrong (Si et al. 2024). Explanations can reduce overreliance when they are cheap to check (Vasconcelos et al. 2023). A recent economic analysis frames the effects of AI progress as a race between cheap automation and costly human verification (Catalini et al. 2026). We contribute a model of where verification effort should be placed, connected to the empirical structure of errors and to published parameters of human verification.</w:t>
       </w:r>
     </w:p>
     <w:bookmarkEnd w:id="22"/>
@@ -4516,7 +4516,7 @@
         <w:pStyle w:val="FirstParagraph"/>
       </w:pPr>
       <w:r>
-        <w:t xml:space="preserve">The results in Section 6 assume that a human check catches an error with certainty. Published data suggest otherwise. In a study of 80 crowdworkers verifying difficult claims, accuracy without assistance was 0.59, and it was 0.73 with retrieved passages and 0.74 with a language-model explanation (Si et al. 2024). [AUTHORS: the figures we cite from this study were obtained through a machine-assisted extraction of the paper’s full text and must be checked against the published tables before submission.] We therefore recompute Proposition 4 with δ equal to 0.75 and 0.60, treating accuracy as an approximation of the probability of catching an error. For RAGTruth summaries with the generating model and source length as signals, targeting saves 25.4 percent of cost relative to the better of verifying everything or nothing at</w:t>
+        <w:t xml:space="preserve">The results in Section 6 assume that a human check catches an error with certainty. Published data suggest otherwise. In a study of 80 crowdworkers verifying difficult claims, accuracy without assistance was 0.59, and it was 0.73 with retrieved passages and 0.74 with a language-model explanation (Si et al. 2024). We therefore recompute Proposition 4 with δ equal to 0.75 and 0.60, treating accuracy as an approximation of the probability of catching an error. For RAGTruth summaries with the generating model and source length as signals, targeting saves 25.4 percent of cost relative to the better of verifying everything or nothing at</w:t>
       </w:r>
       <w:r>
         <w:t xml:space="preserve"> </w:t>
@@ -6379,7 +6379,23 @@
         <w:pStyle w:val="FirstParagraph"/>
       </w:pPr>
       <w:r>
-        <w:t xml:space="preserve">[AUTHORS: every entry must be verified against the original source. Format follows the pattern of reference lists in published ISR articles (surname and initials, year in parentheses, abbreviated journal names); the official INFORMS reference-style guide has not been read, so abbreviations may need adjustment.]</w:t>
+        <w:t xml:space="preserve">Baird A, Maruping LM (2021) The next generation of research on IS use: A theoretical framework of delegation to and from agentic IS artifacts.</w:t>
+      </w:r>
+      <w:r>
+        <w:t xml:space="preserve"> </w:t>
+      </w:r>
+      <w:r>
+        <w:rPr>
+          <w:iCs/>
+          <w:i/>
+        </w:rPr>
+        <w:t xml:space="preserve">MIS Quart.</w:t>
+      </w:r>
+      <w:r>
+        <w:t xml:space="preserve"> </w:t>
+      </w:r>
+      <w:r>
+        <w:t xml:space="preserve">45(1):315–341.</w:t>
       </w:r>
     </w:p>
     <w:p>
@@ -6387,7 +6403,31 @@
         <w:pStyle w:val="BodyText"/>
       </w:pPr>
       <w:r>
-        <w:t xml:space="preserve">Baird A, Maruping LM (2021) The next generation of research on IS use: A theoretical framework of delegation to and from agentic IS artifacts.</w:t>
+        <w:t xml:space="preserve">Bauer K, von Zahn M, Hinz O (2023) Expl(AI)ned: The impact of explainable artificial intelligence on users’ information processing.</w:t>
+      </w:r>
+      <w:r>
+        <w:t xml:space="preserve"> </w:t>
+      </w:r>
+      <w:r>
+        <w:rPr>
+          <w:iCs/>
+          <w:i/>
+        </w:rPr>
+        <w:t xml:space="preserve">Inform. Systems Res.</w:t>
+      </w:r>
+      <w:r>
+        <w:t xml:space="preserve"> </w:t>
+      </w:r>
+      <w:r>
+        <w:t xml:space="preserve">34(4):1582–1602.</w:t>
+      </w:r>
+    </w:p>
+    <w:p>
+      <w:pPr>
+        <w:pStyle w:val="BodyText"/>
+      </w:pPr>
+      <w:r>
+        <w:t xml:space="preserve">Berente N, Gu B, Recker J, Santhanam R (2021) Managing artificial intelligence.</w:t>
       </w:r>
       <w:r>
         <w:t xml:space="preserve"> </w:t>
@@ -6403,7 +6443,7 @@
         <w:t xml:space="preserve"> </w:t>
       </w:r>
       <w:r>
-        <w:t xml:space="preserve">45(1):315–341.</w:t>
+        <w:t xml:space="preserve">45(3):1433–1450.</w:t>
       </w:r>
     </w:p>
     <w:p>
@@ -6411,7 +6451,31 @@
         <w:pStyle w:val="BodyText"/>
       </w:pPr>
       <w:r>
-        <w:t xml:space="preserve">Bauer K, von Zahn M, Hinz O (2023) Expl(AI)ned: The impact of explainable artificial intelligence on users’ information processing.</w:t>
+        <w:t xml:space="preserve">Border KC, Sobel J (1987) Samurai accountant: A theory of auditing and plunder.</w:t>
+      </w:r>
+      <w:r>
+        <w:t xml:space="preserve"> </w:t>
+      </w:r>
+      <w:r>
+        <w:rPr>
+          <w:iCs/>
+          <w:i/>
+        </w:rPr>
+        <w:t xml:space="preserve">Rev. Econom. Stud.</w:t>
+      </w:r>
+      <w:r>
+        <w:t xml:space="preserve"> </w:t>
+      </w:r>
+      <w:r>
+        <w:t xml:space="preserve">54(4):525–540.</w:t>
+      </w:r>
+    </w:p>
+    <w:p>
+      <w:pPr>
+        <w:pStyle w:val="BodyText"/>
+      </w:pPr>
+      <w:r>
+        <w:t xml:space="preserve">Bouayad L, Padmanabhan B, Chari K (2019) Audit policies under the sentinel effect: Deterrence-driven algorithms.</w:t>
       </w:r>
       <w:r>
         <w:t xml:space="preserve"> </w:t>
@@ -6427,7 +6491,7 @@
         <w:t xml:space="preserve"> </w:t>
       </w:r>
       <w:r>
-        <w:t xml:space="preserve">34(4):1582–1602.</w:t>
+        <w:t xml:space="preserve">30(2):466–485.</w:t>
       </w:r>
     </w:p>
     <w:p>
@@ -6435,7 +6499,95 @@
         <w:pStyle w:val="BodyText"/>
       </w:pPr>
       <w:r>
-        <w:t xml:space="preserve">Berente N, Gu B, Recker J, Santhanam R (2021) Managing artificial intelligence.</w:t>
+        <w:t xml:space="preserve">Buçinca Z, Malaya MB, Gajos KZ (2021) To trust or to think: Cognitive forcing functions can reduce overreliance on AI in AI-assisted decision-making.</w:t>
+      </w:r>
+      <w:r>
+        <w:t xml:space="preserve"> </w:t>
+      </w:r>
+      <w:r>
+        <w:rPr>
+          <w:iCs/>
+          <w:i/>
+        </w:rPr>
+        <w:t xml:space="preserve">Proc. ACM Human-Comput. Interaction</w:t>
+      </w:r>
+      <w:r>
+        <w:t xml:space="preserve"> </w:t>
+      </w:r>
+      <w:r>
+        <w:t xml:space="preserve">5(CSCW1):Article 188.</w:t>
+      </w:r>
+    </w:p>
+    <w:p>
+      <w:pPr>
+        <w:pStyle w:val="BodyText"/>
+      </w:pPr>
+      <w:r>
+        <w:t xml:space="preserve">Catalini C, Hui X, Wu J (2026) Some simple economics of AGI. Preprint, arXiv:2602.20946.</w:t>
+      </w:r>
+    </w:p>
+    <w:p>
+      <w:pPr>
+        <w:pStyle w:val="BodyText"/>
+      </w:pPr>
+      <w:r>
+        <w:t xml:space="preserve">Cox DR (1955) Some statistical methods connected with series of events.</w:t>
+      </w:r>
+      <w:r>
+        <w:t xml:space="preserve"> </w:t>
+      </w:r>
+      <w:r>
+        <w:rPr>
+          <w:iCs/>
+          <w:i/>
+        </w:rPr>
+        <w:t xml:space="preserve">J. Roy. Statist. Soc. Ser. B</w:t>
+      </w:r>
+      <w:r>
+        <w:t xml:space="preserve"> </w:t>
+      </w:r>
+      <w:r>
+        <w:t xml:space="preserve">17(2):129–164.</w:t>
+      </w:r>
+    </w:p>
+    <w:p>
+      <w:pPr>
+        <w:pStyle w:val="BodyText"/>
+      </w:pPr>
+      <w:r>
+        <w:t xml:space="preserve">Dell’Acqua F, McFowland E III, Mollick ER, Lifshitz-Assaf H, Kellogg K, Rajendran S, Krayer L, Candelon F, Lakhani KR (2023) Navigating the jagged technological frontier: Field experimental evidence of the effects of AI on knowledge worker productivity and quality. Working paper 24-013, Harvard Business School, Boston.</w:t>
+      </w:r>
+    </w:p>
+    <w:p>
+      <w:pPr>
+        <w:pStyle w:val="BodyText"/>
+      </w:pPr>
+      <w:r>
+        <w:t xml:space="preserve">Dionne G, Giuliano F, Picard P (2009) Optimal auditing with scoring: Theory and application to insurance fraud.</w:t>
+      </w:r>
+      <w:r>
+        <w:t xml:space="preserve"> </w:t>
+      </w:r>
+      <w:r>
+        <w:rPr>
+          <w:iCs/>
+          <w:i/>
+        </w:rPr>
+        <w:t xml:space="preserve">Management Sci.</w:t>
+      </w:r>
+      <w:r>
+        <w:t xml:space="preserve"> </w:t>
+      </w:r>
+      <w:r>
+        <w:t xml:space="preserve">55(1):58–70.</w:t>
+      </w:r>
+    </w:p>
+    <w:p>
+      <w:pPr>
+        <w:pStyle w:val="BodyText"/>
+      </w:pPr>
+      <w:r>
+        <w:t xml:space="preserve">Fügener A, Grahl J, Gupta A, Ketter W (2021) Will humans-in-the-loop become borgs? Merits and pitfalls of working with AI.</w:t>
       </w:r>
       <w:r>
         <w:t xml:space="preserve"> </w:t>
@@ -6451,7 +6603,7 @@
         <w:t xml:space="preserve"> </w:t>
       </w:r>
       <w:r>
-        <w:t xml:space="preserve">45(3):1433–1450.</w:t>
+        <w:t xml:space="preserve">45(3):1527–1556.</w:t>
       </w:r>
     </w:p>
     <w:p>
@@ -6459,7 +6611,31 @@
         <w:pStyle w:val="BodyText"/>
       </w:pPr>
       <w:r>
-        <w:t xml:space="preserve">Border KC, Sobel J (1987) Samurai accountant: A theory of auditing and plunder.</w:t>
+        <w:t xml:space="preserve">Fügener A, Grahl J, Gupta A, Ketter W (2022) Cognitive challenges in human–artificial intelligence collaboration: Investigating the path toward productive delegation.</w:t>
+      </w:r>
+      <w:r>
+        <w:t xml:space="preserve"> </w:t>
+      </w:r>
+      <w:r>
+        <w:rPr>
+          <w:iCs/>
+          <w:i/>
+        </w:rPr>
+        <w:t xml:space="preserve">Inform. Systems Res.</w:t>
+      </w:r>
+      <w:r>
+        <w:t xml:space="preserve"> </w:t>
+      </w:r>
+      <w:r>
+        <w:t xml:space="preserve">33(2):678–696.</w:t>
+      </w:r>
+    </w:p>
+    <w:p>
+      <w:pPr>
+        <w:pStyle w:val="BodyText"/>
+      </w:pPr>
+      <w:r>
+        <w:t xml:space="preserve">Gale D, Hellwig M (1985) Incentive-compatible debt contracts: The one-period problem.</w:t>
       </w:r>
       <w:r>
         <w:t xml:space="preserve"> </w:t>
@@ -6475,7 +6651,7 @@
         <w:t xml:space="preserve"> </w:t>
       </w:r>
       <w:r>
-        <w:t xml:space="preserve">54(4):525–540.</w:t>
+        <w:t xml:space="preserve">52(4):647–663.</w:t>
       </w:r>
     </w:p>
     <w:p>
@@ -6483,7 +6659,103 @@
         <w:pStyle w:val="BodyText"/>
       </w:pPr>
       <w:r>
-        <w:t xml:space="preserve">Bouayad L, Padmanabhan B, Chari K (2019) Audit policies under the sentinel effect: Deterrence-driven algorithms.</w:t>
+        <w:t xml:space="preserve">Goel AL, Okumoto K (1979) Time-dependent error-detection rate model for software reliability and other performance measures.</w:t>
+      </w:r>
+      <w:r>
+        <w:t xml:space="preserve"> </w:t>
+      </w:r>
+      <w:r>
+        <w:rPr>
+          <w:iCs/>
+          <w:i/>
+        </w:rPr>
+        <w:t xml:space="preserve">IEEE Trans. Reliability</w:t>
+      </w:r>
+      <w:r>
+        <w:t xml:space="preserve"> </w:t>
+      </w:r>
+      <w:r>
+        <w:t xml:space="preserve">R-28(3):206–211.</w:t>
+      </w:r>
+    </w:p>
+    <w:p>
+      <w:pPr>
+        <w:pStyle w:val="BodyText"/>
+      </w:pPr>
+      <w:r>
+        <w:t xml:space="preserve">Goodhue DL, Thompson RL (1995) Task-technology fit and individual performance.</w:t>
+      </w:r>
+      <w:r>
+        <w:t xml:space="preserve"> </w:t>
+      </w:r>
+      <w:r>
+        <w:rPr>
+          <w:iCs/>
+          <w:i/>
+        </w:rPr>
+        <w:t xml:space="preserve">MIS Quart.</w:t>
+      </w:r>
+      <w:r>
+        <w:t xml:space="preserve"> </w:t>
+      </w:r>
+      <w:r>
+        <w:t xml:space="preserve">19(2):213–236.</w:t>
+      </w:r>
+    </w:p>
+    <w:p>
+      <w:pPr>
+        <w:pStyle w:val="BodyText"/>
+      </w:pPr>
+      <w:r>
+        <w:t xml:space="preserve">Hawkes AG (1971) Spectra of some self-exciting and mutually exciting point processes.</w:t>
+      </w:r>
+      <w:r>
+        <w:t xml:space="preserve"> </w:t>
+      </w:r>
+      <w:r>
+        <w:rPr>
+          <w:iCs/>
+          <w:i/>
+        </w:rPr>
+        <w:t xml:space="preserve">Biometrika</w:t>
+      </w:r>
+      <w:r>
+        <w:t xml:space="preserve"> </w:t>
+      </w:r>
+      <w:r>
+        <w:t xml:space="preserve">58(1):83–90.</w:t>
+      </w:r>
+    </w:p>
+    <w:p>
+      <w:pPr>
+        <w:pStyle w:val="BodyText"/>
+      </w:pPr>
+      <w:r>
+        <w:t xml:space="preserve">Ji Z, Lee N, Frieske R, Yu T, Su D, Xu Y, Ishii E, Bang YJ, Madotto A, Fung P (2023) Survey of hallucination in natural language generation.</w:t>
+      </w:r>
+      <w:r>
+        <w:t xml:space="preserve"> </w:t>
+      </w:r>
+      <w:r>
+        <w:rPr>
+          <w:iCs/>
+          <w:i/>
+        </w:rPr>
+        <w:t xml:space="preserve">ACM Comput. Surveys</w:t>
+      </w:r>
+      <w:r>
+        <w:t xml:space="preserve"> </w:t>
+      </w:r>
+      <w:r>
+        <w:t xml:space="preserve">55(12):Article 248.</w:t>
+      </w:r>
+    </w:p>
+    <w:p>
+      <w:pPr>
+        <w:pStyle w:val="BodyText"/>
+      </w:pPr>
+      <w:r>
+        <w:t xml:space="preserve">Jussupow E, Bauer K, Heigl RM, Vogt B, Hinz O (2026) The indirect disclosure effect: How disclosing generative AI use impacts human creative collaboration with AI.</w:t>
       </w:r>
       <w:r>
         <w:t xml:space="preserve"> </w:t>
@@ -6499,7 +6771,7 @@
         <w:t xml:space="preserve"> </w:t>
       </w:r>
       <w:r>
-        <w:t xml:space="preserve">30(2):466–485.</w:t>
+        <w:t xml:space="preserve">Published online ahead of print August 27, https://doi.org/10.1287/isre.2024.0951.</w:t>
       </w:r>
     </w:p>
     <w:p>
@@ -6507,7 +6779,265 @@
         <w:pStyle w:val="BodyText"/>
       </w:pPr>
       <w:r>
-        <w:t xml:space="preserve">Buçinca Z, Malaya MB, Gajos KZ (2021) To trust or to think: Cognitive forcing functions can reduce overreliance on AI in AI-assisted decision-making.</w:t>
+        <w:t xml:space="preserve">Leng Y, Yuan Y (2026) SUVA: A probabilistic framework for auditing LLMs with an application to social preferences.</w:t>
+      </w:r>
+      <w:r>
+        <w:t xml:space="preserve"> </w:t>
+      </w:r>
+      <w:r>
+        <w:rPr>
+          <w:iCs/>
+          <w:i/>
+        </w:rPr>
+        <w:t xml:space="preserve">Inform. Systems Res.</w:t>
+      </w:r>
+      <w:r>
+        <w:t xml:space="preserve"> </w:t>
+      </w:r>
+      <w:r>
+        <w:t xml:space="preserve">37(3):1805–1830.</w:t>
+      </w:r>
+    </w:p>
+    <w:p>
+      <w:pPr>
+        <w:pStyle w:val="BodyText"/>
+      </w:pPr>
+      <w:r>
+        <w:t xml:space="preserve">Manakul P, Liusie A, Gales MJF (2023) SelfCheckGPT: Zero-resource black-box hallucination detection for generative large language models.</w:t>
+      </w:r>
+      <w:r>
+        <w:t xml:space="preserve"> </w:t>
+      </w:r>
+      <w:r>
+        <w:rPr>
+          <w:iCs/>
+          <w:i/>
+        </w:rPr>
+        <w:t xml:space="preserve">Proc. 2023 Conf. Empirical Methods Natural Language Processing</w:t>
+      </w:r>
+      <w:r>
+        <w:t xml:space="preserve"> </w:t>
+      </w:r>
+      <w:r>
+        <w:t xml:space="preserve">(Association for Computational Linguistics).</w:t>
+      </w:r>
+    </w:p>
+    <w:p>
+      <w:pPr>
+        <w:pStyle w:val="BodyText"/>
+      </w:pPr>
+      <w:r>
+        <w:t xml:space="preserve">Marshall AW, Olkin I, Arnold BC (2011)</w:t>
+      </w:r>
+      <w:r>
+        <w:t xml:space="preserve"> </w:t>
+      </w:r>
+      <w:r>
+        <w:rPr>
+          <w:iCs/>
+          <w:i/>
+        </w:rPr>
+        <w:t xml:space="preserve">Inequalities: Theory of Majorization and Its Applications</w:t>
+      </w:r>
+      <w:r>
+        <w:t xml:space="preserve">, 2nd ed. (Springer, New York).</w:t>
+      </w:r>
+    </w:p>
+    <w:p>
+      <w:pPr>
+        <w:pStyle w:val="BodyText"/>
+      </w:pPr>
+      <w:r>
+        <w:t xml:space="preserve">Min S, Krishna K, Lyu X, Lewis M, Yih W, Koh PW, Iyyer M, Zettlemoyer L, Hajishirzi H (2023) FActScore: Fine-grained atomic evaluation of factual precision in long form text generation.</w:t>
+      </w:r>
+      <w:r>
+        <w:t xml:space="preserve"> </w:t>
+      </w:r>
+      <w:r>
+        <w:rPr>
+          <w:iCs/>
+          <w:i/>
+        </w:rPr>
+        <w:t xml:space="preserve">Proc. 2023 Conf. Empirical Methods Natural Language Processing</w:t>
+      </w:r>
+      <w:r>
+        <w:t xml:space="preserve"> </w:t>
+      </w:r>
+      <w:r>
+        <w:t xml:space="preserve">(Association for Computational Linguistics).</w:t>
+      </w:r>
+    </w:p>
+    <w:p>
+      <w:pPr>
+        <w:pStyle w:val="BodyText"/>
+      </w:pPr>
+      <w:r>
+        <w:t xml:space="preserve">Mitchell M, Wu S, Zaldivar A, Barnes P, Vasserman L, Hutchinson B, Spitzer E, Raji ID, Gebru T (2019) Model cards for model reporting.</w:t>
+      </w:r>
+      <w:r>
+        <w:t xml:space="preserve"> </w:t>
+      </w:r>
+      <w:r>
+        <w:rPr>
+          <w:iCs/>
+          <w:i/>
+        </w:rPr>
+        <w:t xml:space="preserve">Proc. Conf. Fairness, Accountability, Transparency</w:t>
+      </w:r>
+      <w:r>
+        <w:t xml:space="preserve"> </w:t>
+      </w:r>
+      <w:r>
+        <w:t xml:space="preserve">(ACM, New York), 220–229.</w:t>
+      </w:r>
+    </w:p>
+    <w:p>
+      <w:pPr>
+        <w:pStyle w:val="BodyText"/>
+      </w:pPr>
+      <w:r>
+        <w:t xml:space="preserve">Niu C, Wu Y, Zhu J, Xu S, Shum K, Zhong R, Song J, Zhang T (2024) RAGTruth: A hallucination corpus for developing trustworthy retrieval-augmented language models.</w:t>
+      </w:r>
+      <w:r>
+        <w:t xml:space="preserve"> </w:t>
+      </w:r>
+      <w:r>
+        <w:rPr>
+          <w:iCs/>
+          <w:i/>
+        </w:rPr>
+        <w:t xml:space="preserve">Proc. 62nd Annual Meeting Assoc. Comput. Linguistics</w:t>
+      </w:r>
+      <w:r>
+        <w:t xml:space="preserve"> </w:t>
+      </w:r>
+      <w:r>
+        <w:t xml:space="preserve">(Association for Computational Linguistics).</w:t>
+      </w:r>
+    </w:p>
+    <w:p>
+      <w:pPr>
+        <w:pStyle w:val="BodyText"/>
+      </w:pPr>
+      <w:r>
+        <w:t xml:space="preserve">Parasuraman R, Manzey DH (2010) Complacency and bias in human use of automation: An attentional integration.</w:t>
+      </w:r>
+      <w:r>
+        <w:t xml:space="preserve"> </w:t>
+      </w:r>
+      <w:r>
+        <w:rPr>
+          <w:iCs/>
+          <w:i/>
+        </w:rPr>
+        <w:t xml:space="preserve">Human Factors</w:t>
+      </w:r>
+      <w:r>
+        <w:t xml:space="preserve"> </w:t>
+      </w:r>
+      <w:r>
+        <w:t xml:space="preserve">52(3):381–410.</w:t>
+      </w:r>
+    </w:p>
+    <w:p>
+      <w:pPr>
+        <w:pStyle w:val="BodyText"/>
+      </w:pPr>
+      <w:r>
+        <w:t xml:space="preserve">Si C, Goyal N, Wu ST, Zhao C, Feng S, Daumé H III, Boyd-Graber J (2024) Large language models help humans verify truthfulness—except when they are convincingly wrong.</w:t>
+      </w:r>
+      <w:r>
+        <w:t xml:space="preserve"> </w:t>
+      </w:r>
+      <w:r>
+        <w:rPr>
+          <w:iCs/>
+          <w:i/>
+        </w:rPr>
+        <w:t xml:space="preserve">Proc. 2024 Conf. North Amer. Chapter Assoc. Comput. Linguistics</w:t>
+      </w:r>
+      <w:r>
+        <w:t xml:space="preserve"> </w:t>
+      </w:r>
+      <w:r>
+        <w:t xml:space="preserve">(Association for Computational Linguistics). arXiv:2310.12558.</w:t>
+      </w:r>
+    </w:p>
+    <w:p>
+      <w:pPr>
+        <w:pStyle w:val="BodyText"/>
+      </w:pPr>
+      <w:r>
+        <w:t xml:space="preserve">Taudien A, Fügener A, Gupta A, Ketter W (2026) Enhancing AI use: How complementary system information drives delegation frequency and effectiveness.</w:t>
+      </w:r>
+      <w:r>
+        <w:t xml:space="preserve"> </w:t>
+      </w:r>
+      <w:r>
+        <w:rPr>
+          <w:iCs/>
+          <w:i/>
+        </w:rPr>
+        <w:t xml:space="preserve">Inform. Systems Res.</w:t>
+      </w:r>
+      <w:r>
+        <w:t xml:space="preserve"> </w:t>
+      </w:r>
+      <w:r>
+        <w:t xml:space="preserve">Published online ahead of print September 4, https://doi.org/10.1287/isre.2024.1330.</w:t>
+      </w:r>
+    </w:p>
+    <w:p>
+      <w:pPr>
+        <w:pStyle w:val="BodyText"/>
+      </w:pPr>
+      <w:r>
+        <w:t xml:space="preserve">Townsend RM (1979) Optimal contracts and competitive markets with costly state verification.</w:t>
+      </w:r>
+      <w:r>
+        <w:t xml:space="preserve"> </w:t>
+      </w:r>
+      <w:r>
+        <w:rPr>
+          <w:iCs/>
+          <w:i/>
+        </w:rPr>
+        <w:t xml:space="preserve">J. Econom. Theory</w:t>
+      </w:r>
+      <w:r>
+        <w:t xml:space="preserve"> </w:t>
+      </w:r>
+      <w:r>
+        <w:t xml:space="preserve">21(2):265–293.</w:t>
+      </w:r>
+    </w:p>
+    <w:p>
+      <w:pPr>
+        <w:pStyle w:val="BodyText"/>
+      </w:pPr>
+      <w:r>
+        <w:t xml:space="preserve">Tu L, Meng R, Joty S, Zhou Y, Yavuz S (2025) Investigating factuality in long-form text generation: The roles of self-known and self-unknown.</w:t>
+      </w:r>
+      <w:r>
+        <w:t xml:space="preserve"> </w:t>
+      </w:r>
+      <w:r>
+        <w:rPr>
+          <w:iCs/>
+          <w:i/>
+        </w:rPr>
+        <w:t xml:space="preserve">Proc. UncertaiNLP Workshop 2025</w:t>
+      </w:r>
+      <w:r>
+        <w:t xml:space="preserve">. arXiv:2411.15993.</w:t>
+      </w:r>
+    </w:p>
+    <w:p>
+      <w:pPr>
+        <w:pStyle w:val="BodyText"/>
+      </w:pPr>
+      <w:r>
+        <w:t xml:space="preserve">Vasconcelos H, Jörke M, Grunde-McLaughlin M, Gerstenberg T, Bernstein MS, Krishna R (2023) Explanations can reduce overreliance on AI systems during decision-making.</w:t>
       </w:r>
       <w:r>
         <w:t xml:space="preserve"> </w:t>
@@ -6523,7 +7053,7 @@
         <w:t xml:space="preserve"> </w:t>
       </w:r>
       <w:r>
-        <w:t xml:space="preserve">5(CSCW1):Article 188.</w:t>
+        <w:t xml:space="preserve">7(CSCW1):Article 129.</w:t>
       </w:r>
     </w:p>
     <w:p>
@@ -6531,7 +7061,20 @@
         <w:pStyle w:val="BodyText"/>
       </w:pPr>
       <w:r>
-        <w:t xml:space="preserve">Catalini C, Hui X, Wu J (2026) Some simple economics of AGI. Preprint, arXiv:2602.20946. [AUTHORS: verify authors and status.]</w:t>
+        <w:t xml:space="preserve">Wei J, Yang C, Song X, Lu Y, Hu N, Huang J, Tran D, Peng D, Liu R, Huang D, Du C, Le QV (2024) Long-form factuality in large language models.</w:t>
+      </w:r>
+      <w:r>
+        <w:t xml:space="preserve"> </w:t>
+      </w:r>
+      <w:r>
+        <w:rPr>
+          <w:iCs/>
+          <w:i/>
+        </w:rPr>
+        <w:t xml:space="preserve">Adv. Neural Inform. Processing Systems</w:t>
+      </w:r>
+      <w:r>
+        <w:t xml:space="preserve">, vol. 37. arXiv:2403.18802.</w:t>
       </w:r>
     </w:p>
     <w:p>
@@ -6539,576 +7082,7 @@
         <w:pStyle w:val="BodyText"/>
       </w:pPr>
       <w:r>
-        <w:t xml:space="preserve">Cox DR (1955) Some statistical methods connected with series of events.</w:t>
-      </w:r>
-      <w:r>
-        <w:t xml:space="preserve"> </w:t>
-      </w:r>
-      <w:r>
-        <w:rPr>
-          <w:iCs/>
-          <w:i/>
-        </w:rPr>
-        <w:t xml:space="preserve">J. Roy. Statist. Soc. Ser. B</w:t>
-      </w:r>
-      <w:r>
-        <w:t xml:space="preserve"> </w:t>
-      </w:r>
-      <w:r>
-        <w:t xml:space="preserve">17(2):129–164.</w:t>
-      </w:r>
-    </w:p>
-    <w:p>
-      <w:pPr>
-        <w:pStyle w:val="BodyText"/>
-      </w:pPr>
-      <w:r>
-        <w:t xml:space="preserve">Dell’Acqua F, McFowland E III, Mollick ER, Lifshitz-Assaf H, Kellogg K, Rajendran S, Krayer L, Candelon F, Lakhani KR (2023) Navigating the jagged technological frontier: Field experimental evidence of the effects of AI on knowledge worker productivity and quality. Working paper 24-013, Harvard Business School, Boston.</w:t>
-      </w:r>
-    </w:p>
-    <w:p>
-      <w:pPr>
-        <w:pStyle w:val="BodyText"/>
-      </w:pPr>
-      <w:r>
-        <w:t xml:space="preserve">Dionne G, Giuliano F, Picard P (2009) Optimal auditing with scoring: Theory and application to insurance fraud.</w:t>
-      </w:r>
-      <w:r>
-        <w:t xml:space="preserve"> </w:t>
-      </w:r>
-      <w:r>
-        <w:rPr>
-          <w:iCs/>
-          <w:i/>
-        </w:rPr>
-        <w:t xml:space="preserve">Management Sci.</w:t>
-      </w:r>
-      <w:r>
-        <w:t xml:space="preserve"> </w:t>
-      </w:r>
-      <w:r>
-        <w:t xml:space="preserve">55(1):58–70.</w:t>
-      </w:r>
-    </w:p>
-    <w:p>
-      <w:pPr>
-        <w:pStyle w:val="BodyText"/>
-      </w:pPr>
-      <w:r>
-        <w:t xml:space="preserve">Fügener A, Grahl J, Gupta A, Ketter W (2021) Will humans-in-the-loop become borgs? Merits and pitfalls of working with AI.</w:t>
-      </w:r>
-      <w:r>
-        <w:t xml:space="preserve"> </w:t>
-      </w:r>
-      <w:r>
-        <w:rPr>
-          <w:iCs/>
-          <w:i/>
-        </w:rPr>
-        <w:t xml:space="preserve">MIS Quart.</w:t>
-      </w:r>
-      <w:r>
-        <w:t xml:space="preserve"> </w:t>
-      </w:r>
-      <w:r>
-        <w:t xml:space="preserve">45(3):1527–1556.</w:t>
-      </w:r>
-    </w:p>
-    <w:p>
-      <w:pPr>
-        <w:pStyle w:val="BodyText"/>
-      </w:pPr>
-      <w:r>
-        <w:t xml:space="preserve">Fügener A, Grahl J, Gupta A, Ketter W (2022) Cognitive challenges in human–artificial intelligence collaboration: Investigating the path toward productive delegation.</w:t>
-      </w:r>
-      <w:r>
-        <w:t xml:space="preserve"> </w:t>
-      </w:r>
-      <w:r>
-        <w:rPr>
-          <w:iCs/>
-          <w:i/>
-        </w:rPr>
-        <w:t xml:space="preserve">Inform. Systems Res.</w:t>
-      </w:r>
-      <w:r>
-        <w:t xml:space="preserve"> </w:t>
-      </w:r>
-      <w:r>
-        <w:t xml:space="preserve">33(2):678–696.</w:t>
-      </w:r>
-    </w:p>
-    <w:p>
-      <w:pPr>
-        <w:pStyle w:val="BodyText"/>
-      </w:pPr>
-      <w:r>
-        <w:t xml:space="preserve">Gale D, Hellwig M (1985) Incentive-compatible debt contracts: The one-period problem.</w:t>
-      </w:r>
-      <w:r>
-        <w:t xml:space="preserve"> </w:t>
-      </w:r>
-      <w:r>
-        <w:rPr>
-          <w:iCs/>
-          <w:i/>
-        </w:rPr>
-        <w:t xml:space="preserve">Rev. Econom. Stud.</w:t>
-      </w:r>
-      <w:r>
-        <w:t xml:space="preserve"> </w:t>
-      </w:r>
-      <w:r>
-        <w:t xml:space="preserve">52(4):647–663.</w:t>
-      </w:r>
-    </w:p>
-    <w:p>
-      <w:pPr>
-        <w:pStyle w:val="BodyText"/>
-      </w:pPr>
-      <w:r>
-        <w:t xml:space="preserve">Goel AL, Okumoto K (1979) Time-dependent error-detection rate model for software reliability and other performance measures.</w:t>
-      </w:r>
-      <w:r>
-        <w:t xml:space="preserve"> </w:t>
-      </w:r>
-      <w:r>
-        <w:rPr>
-          <w:iCs/>
-          <w:i/>
-        </w:rPr>
-        <w:t xml:space="preserve">IEEE Trans. Reliability</w:t>
-      </w:r>
-      <w:r>
-        <w:t xml:space="preserve"> </w:t>
-      </w:r>
-      <w:r>
-        <w:t xml:space="preserve">R-28(3):206–211.</w:t>
-      </w:r>
-    </w:p>
-    <w:p>
-      <w:pPr>
-        <w:pStyle w:val="BodyText"/>
-      </w:pPr>
-      <w:r>
-        <w:t xml:space="preserve">Goodhue DL, Thompson RL (1995) Task-technology fit and individual performance.</w:t>
-      </w:r>
-      <w:r>
-        <w:t xml:space="preserve"> </w:t>
-      </w:r>
-      <w:r>
-        <w:rPr>
-          <w:iCs/>
-          <w:i/>
-        </w:rPr>
-        <w:t xml:space="preserve">MIS Quart.</w:t>
-      </w:r>
-      <w:r>
-        <w:t xml:space="preserve"> </w:t>
-      </w:r>
-      <w:r>
-        <w:t xml:space="preserve">19(2):213–236.</w:t>
-      </w:r>
-    </w:p>
-    <w:p>
-      <w:pPr>
-        <w:pStyle w:val="BodyText"/>
-      </w:pPr>
-      <w:r>
-        <w:t xml:space="preserve">Hawkes AG (1971) Spectra of some self-exciting and mutually exciting point processes.</w:t>
-      </w:r>
-      <w:r>
-        <w:t xml:space="preserve"> </w:t>
-      </w:r>
-      <w:r>
-        <w:rPr>
-          <w:iCs/>
-          <w:i/>
-        </w:rPr>
-        <w:t xml:space="preserve">Biometrika</w:t>
-      </w:r>
-      <w:r>
-        <w:t xml:space="preserve"> </w:t>
-      </w:r>
-      <w:r>
-        <w:t xml:space="preserve">58(1):83–90.</w:t>
-      </w:r>
-    </w:p>
-    <w:p>
-      <w:pPr>
-        <w:pStyle w:val="BodyText"/>
-      </w:pPr>
-      <w:r>
-        <w:t xml:space="preserve">Ji Z, Lee N, Frieske R, Yu T, Su D, Xu Y, Ishii E, Bang YJ, Madotto A, Fung P (2023) Survey of hallucination in natural language generation.</w:t>
-      </w:r>
-      <w:r>
-        <w:t xml:space="preserve"> </w:t>
-      </w:r>
-      <w:r>
-        <w:rPr>
-          <w:iCs/>
-          <w:i/>
-        </w:rPr>
-        <w:t xml:space="preserve">ACM Comput. Surveys</w:t>
-      </w:r>
-      <w:r>
-        <w:t xml:space="preserve"> </w:t>
-      </w:r>
-      <w:r>
-        <w:t xml:space="preserve">55(12):Article 248.</w:t>
-      </w:r>
-    </w:p>
-    <w:p>
-      <w:pPr>
-        <w:pStyle w:val="BodyText"/>
-      </w:pPr>
-      <w:r>
-        <w:t xml:space="preserve">Jussupow E, Bauer K, Heigl RM, Vogt B, Hinz O (2026) The indirect disclosure effect: How disclosing generative AI use impacts human creative collaboration with AI.</w:t>
-      </w:r>
-      <w:r>
-        <w:t xml:space="preserve"> </w:t>
-      </w:r>
-      <w:r>
-        <w:rPr>
-          <w:iCs/>
-          <w:i/>
-        </w:rPr>
-        <w:t xml:space="preserve">Inform. Systems Res.</w:t>
-      </w:r>
-      <w:r>
-        <w:t xml:space="preserve"> </w:t>
-      </w:r>
-      <w:r>
-        <w:t xml:space="preserve">Published online ahead of print August 27, https://doi.org/10.1287/isre.2024.0951.</w:t>
-      </w:r>
-    </w:p>
-    <w:p>
-      <w:pPr>
-        <w:pStyle w:val="BodyText"/>
-      </w:pPr>
-      <w:r>
-        <w:t xml:space="preserve">Leng Y, Yuan Y (2026) SUVA: A probabilistic framework for auditing LLMs with an application to social preferences.</w:t>
-      </w:r>
-      <w:r>
-        <w:t xml:space="preserve"> </w:t>
-      </w:r>
-      <w:r>
-        <w:rPr>
-          <w:iCs/>
-          <w:i/>
-        </w:rPr>
-        <w:t xml:space="preserve">Inform. Systems Res.</w:t>
-      </w:r>
-      <w:r>
-        <w:t xml:space="preserve"> </w:t>
-      </w:r>
-      <w:r>
-        <w:t xml:space="preserve">37(3):1805–1830.</w:t>
-      </w:r>
-    </w:p>
-    <w:p>
-      <w:pPr>
-        <w:pStyle w:val="BodyText"/>
-      </w:pPr>
-      <w:r>
-        <w:t xml:space="preserve">Manakul P, Liusie A, Gales MJF (2023) SelfCheckGPT: Zero-resource black-box hallucination detection for generative large language models.</w:t>
-      </w:r>
-      <w:r>
-        <w:t xml:space="preserve"> </w:t>
-      </w:r>
-      <w:r>
-        <w:rPr>
-          <w:iCs/>
-          <w:i/>
-        </w:rPr>
-        <w:t xml:space="preserve">Proc. 2023 Conf. Empirical Methods Natural Language Processing</w:t>
-      </w:r>
-      <w:r>
-        <w:t xml:space="preserve"> </w:t>
-      </w:r>
-      <w:r>
-        <w:t xml:space="preserve">(Association for Computational Linguistics).</w:t>
-      </w:r>
-    </w:p>
-    <w:p>
-      <w:pPr>
-        <w:pStyle w:val="BodyText"/>
-      </w:pPr>
-      <w:r>
-        <w:t xml:space="preserve">Marshall AW, Olkin I, Arnold BC (2011)</w:t>
-      </w:r>
-      <w:r>
-        <w:t xml:space="preserve"> </w:t>
-      </w:r>
-      <w:r>
-        <w:rPr>
-          <w:iCs/>
-          <w:i/>
-        </w:rPr>
-        <w:t xml:space="preserve">Inequalities: Theory of Majorization and Its Applications</w:t>
-      </w:r>
-      <w:r>
-        <w:t xml:space="preserve">, 2nd ed. (Springer, New York).</w:t>
-      </w:r>
-    </w:p>
-    <w:p>
-      <w:pPr>
-        <w:pStyle w:val="BodyText"/>
-      </w:pPr>
-      <w:r>
-        <w:t xml:space="preserve">Min S, Krishna K, Lyu X, Lewis M, Yih W, Koh PW, Iyyer M, Zettlemoyer L, Hajishirzi H (2023) FActScore: Fine-grained atomic evaluation of factual precision in long form text generation.</w:t>
-      </w:r>
-      <w:r>
-        <w:t xml:space="preserve"> </w:t>
-      </w:r>
-      <w:r>
-        <w:rPr>
-          <w:iCs/>
-          <w:i/>
-        </w:rPr>
-        <w:t xml:space="preserve">Proc. 2023 Conf. Empirical Methods Natural Language Processing</w:t>
-      </w:r>
-      <w:r>
-        <w:t xml:space="preserve"> </w:t>
-      </w:r>
-      <w:r>
-        <w:t xml:space="preserve">(Association for Computational Linguistics).</w:t>
-      </w:r>
-    </w:p>
-    <w:p>
-      <w:pPr>
-        <w:pStyle w:val="BodyText"/>
-      </w:pPr>
-      <w:r>
-        <w:t xml:space="preserve">Mitchell M, Wu S, Zaldivar A, Barnes P, Vasserman L, Hutchinson B, Spitzer E, Raji ID, Gebru T (2019) Model cards for model reporting.</w:t>
-      </w:r>
-      <w:r>
-        <w:t xml:space="preserve"> </w:t>
-      </w:r>
-      <w:r>
-        <w:rPr>
-          <w:iCs/>
-          <w:i/>
-        </w:rPr>
-        <w:t xml:space="preserve">Proc. Conf. Fairness, Accountability, Transparency</w:t>
-      </w:r>
-      <w:r>
-        <w:t xml:space="preserve"> </w:t>
-      </w:r>
-      <w:r>
-        <w:t xml:space="preserve">(ACM, New York), 220–229.</w:t>
-      </w:r>
-    </w:p>
-    <w:p>
-      <w:pPr>
-        <w:pStyle w:val="BodyText"/>
-      </w:pPr>
-      <w:r>
-        <w:t xml:space="preserve">Niu C, Wu Y, Zhu J, Xu S, Shum K, Zhong R, Song J, Zhang T (2024) RAGTruth: A hallucination corpus for developing trustworthy retrieval-augmented language models.</w:t>
-      </w:r>
-      <w:r>
-        <w:t xml:space="preserve"> </w:t>
-      </w:r>
-      <w:r>
-        <w:rPr>
-          <w:iCs/>
-          <w:i/>
-        </w:rPr>
-        <w:t xml:space="preserve">Proc. 62nd Annual Meeting Assoc. Comput. Linguistics</w:t>
-      </w:r>
-      <w:r>
-        <w:t xml:space="preserve"> </w:t>
-      </w:r>
-      <w:r>
-        <w:t xml:space="preserve">(Association for Computational Linguistics).</w:t>
-      </w:r>
-    </w:p>
-    <w:p>
-      <w:pPr>
-        <w:pStyle w:val="BodyText"/>
-      </w:pPr>
-      <w:r>
-        <w:t xml:space="preserve">Parasuraman R, Manzey DH (2010) Complacency and bias in human use of automation: An attentional integration.</w:t>
-      </w:r>
-      <w:r>
-        <w:t xml:space="preserve"> </w:t>
-      </w:r>
-      <w:r>
-        <w:rPr>
-          <w:iCs/>
-          <w:i/>
-        </w:rPr>
-        <w:t xml:space="preserve">Human Factors</w:t>
-      </w:r>
-      <w:r>
-        <w:t xml:space="preserve"> </w:t>
-      </w:r>
-      <w:r>
-        <w:t xml:space="preserve">52(3):381–410.</w:t>
-      </w:r>
-    </w:p>
-    <w:p>
-      <w:pPr>
-        <w:pStyle w:val="BodyText"/>
-      </w:pPr>
-      <w:r>
-        <w:t xml:space="preserve">Si C, Goyal N, Wu ST, Zhao C, Feng S, Daumé H III, Boyd-Graber J (2024) Large language models help humans verify truthfulness—except when they are convincingly wrong.</w:t>
-      </w:r>
-      <w:r>
-        <w:t xml:space="preserve"> </w:t>
-      </w:r>
-      <w:r>
-        <w:rPr>
-          <w:iCs/>
-          <w:i/>
-        </w:rPr>
-        <w:t xml:space="preserve">Proc. 2024 Conf. North Amer. Chapter Assoc. Comput. Linguistics</w:t>
-      </w:r>
-      <w:r>
-        <w:t xml:space="preserve"> </w:t>
-      </w:r>
-      <w:r>
-        <w:t xml:space="preserve">(Association for Computational Linguistics). arXiv:2310.12558.</w:t>
-      </w:r>
-    </w:p>
-    <w:p>
-      <w:pPr>
-        <w:pStyle w:val="BodyText"/>
-      </w:pPr>
-      <w:r>
-        <w:t xml:space="preserve">Taudien A, Fügener A, Gupta A, Ketter W (2026) Enhancing AI use: How complementary system information drives delegation frequency and effectiveness.</w:t>
-      </w:r>
-      <w:r>
-        <w:t xml:space="preserve"> </w:t>
-      </w:r>
-      <w:r>
-        <w:rPr>
-          <w:iCs/>
-          <w:i/>
-        </w:rPr>
-        <w:t xml:space="preserve">Inform. Systems Res.</w:t>
-      </w:r>
-      <w:r>
-        <w:t xml:space="preserve"> </w:t>
-      </w:r>
-      <w:r>
-        <w:t xml:space="preserve">Published online ahead of print September 4, https://doi.org/10.1287/isre.2024.1330. [AUTHORS: update volume and pages if the article has appeared in an issue.]</w:t>
-      </w:r>
-    </w:p>
-    <w:p>
-      <w:pPr>
-        <w:pStyle w:val="BodyText"/>
-      </w:pPr>
-      <w:r>
-        <w:t xml:space="preserve">Townsend RM (1979) Optimal contracts and competitive markets with costly state verification.</w:t>
-      </w:r>
-      <w:r>
-        <w:t xml:space="preserve"> </w:t>
-      </w:r>
-      <w:r>
-        <w:rPr>
-          <w:iCs/>
-          <w:i/>
-        </w:rPr>
-        <w:t xml:space="preserve">J. Econom. Theory</w:t>
-      </w:r>
-      <w:r>
-        <w:t xml:space="preserve"> </w:t>
-      </w:r>
-      <w:r>
-        <w:t xml:space="preserve">21(2):265–293.</w:t>
-      </w:r>
-    </w:p>
-    <w:p>
-      <w:pPr>
-        <w:pStyle w:val="BodyText"/>
-      </w:pPr>
-      <w:r>
-        <w:t xml:space="preserve">Tu L, Meng R, Joty S, Zhou Y, Yavuz S (2025) Investigating factuality in long-form text generation: The roles of self-known and self-unknown.</w:t>
-      </w:r>
-      <w:r>
-        <w:t xml:space="preserve"> </w:t>
-      </w:r>
-      <w:r>
-        <w:rPr>
-          <w:iCs/>
-          <w:i/>
-        </w:rPr>
-        <w:t xml:space="preserve">Proc. UncertaiNLP Workshop 2025</w:t>
-      </w:r>
-      <w:r>
-        <w:t xml:space="preserve">. arXiv:2411.15993. [AUTHORS: confirm venue (ACL Anthology lists UncertaiNLP 2025; another listing says EMNLP 2025).]</w:t>
-      </w:r>
-    </w:p>
-    <w:p>
-      <w:pPr>
-        <w:pStyle w:val="BodyText"/>
-      </w:pPr>
-      <w:r>
-        <w:t xml:space="preserve">Vasconcelos H, Jörke M, Grunde-McLaughlin M, Gerstenberg T, Bernstein MS, Krishna R (2023) Explanations can reduce overreliance on AI systems during decision-making.</w:t>
-      </w:r>
-      <w:r>
-        <w:t xml:space="preserve"> </w:t>
-      </w:r>
-      <w:r>
-        <w:rPr>
-          <w:iCs/>
-          <w:i/>
-        </w:rPr>
-        <w:t xml:space="preserve">Proc. ACM Human-Comput. Interaction</w:t>
-      </w:r>
-      <w:r>
-        <w:t xml:space="preserve"> </w:t>
-      </w:r>
-      <w:r>
-        <w:t xml:space="preserve">7(CSCW1):Article 129.</w:t>
-      </w:r>
-    </w:p>
-    <w:p>
-      <w:pPr>
-        <w:pStyle w:val="BodyText"/>
-      </w:pPr>
-      <w:r>
-        <w:t xml:space="preserve">Wei J, Yang C, Song X, Lu Y, Hu N, Huang J, Tran D, Peng D, Liu R, Huang D, Du C, Le QV (2024) Long-form factuality in large language models.</w:t>
-      </w:r>
-      <w:r>
-        <w:t xml:space="preserve"> </w:t>
-      </w:r>
-      <w:r>
-        <w:rPr>
-          <w:iCs/>
-          <w:i/>
-        </w:rPr>
-        <w:t xml:space="preserve">Adv. Neural Inform. Processing Systems</w:t>
-      </w:r>
-      <w:r>
-        <w:t xml:space="preserve">, vol. 37. arXiv:2403.18802.</w:t>
-      </w:r>
-    </w:p>
-    <w:p>
-      <w:pPr>
-        <w:pStyle w:val="BodyText"/>
-      </w:pPr>
-      <w:r>
-        <w:t xml:space="preserve">Yang J, Yoon S, Chang H, Kim B, Lee H (2025) Hallucinate at the last in long response generation: A case study on long document summarization. Preprint, arXiv:2505.15291. [AUTHORS: check the spelling of the fifth-listed name</w:t>
-      </w:r>
-      <w:r>
-        <w:t xml:space="preserve"> </w:t>
-      </w:r>
-      <w:r>
-        <w:t xml:space="preserve">“</w:t>
-      </w:r>
-      <w:r>
-        <w:t xml:space="preserve">Hwan Chang</w:t>
-      </w:r>
-      <w:r>
-        <w:t xml:space="preserve">”</w:t>
-      </w:r>
-      <w:r>
-        <w:t xml:space="preserve"> </w:t>
-      </w:r>
-      <w:r>
-        <w:t xml:space="preserve">and whether a venue exists.]</w:t>
+        <w:t xml:space="preserve">Yang J, Yoon S, Chang H, Kim B, Lee H (2025) Hallucinate at the last in long response generation: A case study on long document summarization. Preprint, arXiv:2505.15291.</w:t>
       </w:r>
     </w:p>
     <w:p>

</xml_diff>